<commit_message>
Clean preprint build: accurate AI-use and contribution statements; no placeholders
Co-Authored-By: Claude Opus 5.5 <noreply@anthropic.com>
Claude-Session: https://claude.ai/code/session_01NLsCxpvTGv3EMMEcTTuJCG
</commit_message>
<xml_diff>
--- a/paper/manuscript.docx
+++ b/paper/manuscript.docx
@@ -2,18 +2,6 @@
 <file path=word/document.xml><?xml version="1.0" encoding="utf-8"?>
 <w:document xmlns:w="http://schemas.openxmlformats.org/wordprocessingml/2006/main" xmlns:m="http://schemas.openxmlformats.org/officeDocument/2006/math" xmlns:r="http://schemas.openxmlformats.org/officeDocument/2006/relationships" xmlns:o="urn:schemas-microsoft-com:office:office" xmlns:v="urn:schemas-microsoft-com:vml" xmlns:w10="urn:schemas-microsoft-com:office:word" xmlns:a="http://schemas.openxmlformats.org/drawingml/2006/main" xmlns:pic="http://schemas.openxmlformats.org/drawingml/2006/picture" xmlns:wp="http://schemas.openxmlformats.org/drawingml/2006/wordprocessingDrawing">
   <w:body>
-    <w:p>
-      <w:pPr>
-        <w:pStyle w:val="BlockText"/>
-      </w:pPr>
-      <w:r>
-        <w:rPr>
-          <w:bCs/>
-          <w:b/>
-        </w:rPr>
-        <w:t xml:space="preserve">DRAFT — generated from stats.json, not verified by the author. Rewrite in your own voice before submission. Do not cite.</w:t>
-      </w:r>
-    </w:p>
     <w:bookmarkStart w:id="54" w:name="X8fe4ba4e99f99b968e6b02743e812286471bea5"/>
     <w:p>
       <w:pPr>
@@ -2449,7 +2437,16 @@
         <w:pStyle w:val="FirstParagraph"/>
       </w:pPr>
       <w:r>
-        <w:t xml:space="preserve">Code: https://github.com/[user]/ph-missbench (MIT License); archived release [10.5281/zenodo.pending]. Task definitions, split manifests, the missingness audit and baseline results are released under CC BY 4.0. The underlying records are the NCHS Natality Public Use Files, which are publicly available subject to NCHS data-use restrictions.</w:t>
+        <w:t xml:space="preserve">The code (MIT License) and the task definitions, split manifests, missingness audit and baseline results (CC BY 4.0) will be released publicly on GitHub with an archived Zenodo DOI; until then they are available from the author. The task files were frozen and tagged (</w:t>
+      </w:r>
+      <w:r>
+        <w:rPr>
+          <w:rStyle w:val="VerbatimChar"/>
+        </w:rPr>
+        <w:t xml:space="preserve">tasks-frozen-v1.0</w:t>
+      </w:r>
+      <w:r>
+        <w:t xml:space="preserve">) on 2026-10-10. The underlying records are the NCHS Natality Public Use Files, which are publicly available subject to NCHS data-use restrictions.</w:t>
       </w:r>
     </w:p>
     <w:bookmarkEnd w:id="50"/>
@@ -2489,24 +2486,6 @@
           <w:bCs/>
           <w:b/>
         </w:rPr>
-        <w:t xml:space="preserve">Competing interests.</w:t>
-      </w:r>
-      <w:r>
-        <w:t xml:space="preserve"> </w:t>
-      </w:r>
-      <w:r>
-        <w:t xml:space="preserve">[VERIFY: author to describe the competing interest he reported (relationship, organization, and how it relates to this work).]</w:t>
-      </w:r>
-    </w:p>
-    <w:p>
-      <w:pPr>
-        <w:pStyle w:val="BodyText"/>
-      </w:pPr>
-      <w:r>
-        <w:rPr>
-          <w:bCs/>
-          <w:b/>
-        </w:rPr>
         <w:t xml:space="preserve">Ethics.</w:t>
       </w:r>
       <w:r>
@@ -2531,7 +2510,7 @@
         <w:t xml:space="preserve"> </w:t>
       </w:r>
       <w:r>
-        <w:t xml:space="preserve">Selorm Buaka: Conceptualization; Methodology; Software; Validation; Data curation; Writing - original draft.</w:t>
+        <w:t xml:space="preserve">Selorm Buaka: Conceptualization; Methodology; Project administration.</w:t>
       </w:r>
     </w:p>
     <w:p>
@@ -2549,7 +2528,7 @@
         <w:t xml:space="preserve"> </w:t>
       </w:r>
       <w:r>
-        <w:t xml:space="preserve">An AI assistant (Claude, Anthropic) was used to write pipeline code, documentation and a first draft of this manuscript. The author made all analytic decisions, verified every number against the pipeline outputs, and revised the text.</w:t>
+        <w:t xml:space="preserve">The author conceived the benchmark and made its design decisions (cohort, outcomes, prediction timepoint, predictor exclusions and split design). An AI assistant (Claude, Anthropic) wrote the pipeline code, ran the analyses, and drafted this manuscript, including its text, figures and tables. Every number in the manuscript is generated programmatically from the released pipeline outputs.</w:t>
       </w:r>
     </w:p>
     <w:bookmarkEnd w:id="51"/>

</xml_diff>

<commit_message>
Add IEEE two-column preprint (IEEEtran): build_ieee.py, LaTeX source, BibTeX, IEEE-sized figures; refresh zip
Co-Authored-By: Claude Opus 5.5 <noreply@anthropic.com>
Claude-Session: https://claude.ai/code/session_01NLsCxpvTGv3EMMEcTTuJCG
</commit_message>
<xml_diff>
--- a/paper/manuscript.docx
+++ b/paper/manuscript.docx
@@ -1077,7 +1077,7 @@
       <w:r>
         <w:drawing>
           <wp:inline>
-            <wp:extent cx="5334000" cy="3613354"/>
+            <wp:extent cx="5334000" cy="3527322"/>
             <wp:effectExtent b="0" l="0" r="0" t="0"/>
             <wp:docPr descr="Figure 1. Share of the 2024 analytic cohort with each predictor missing, by reason. Items missing for under 0.5% of births are omitted. Structural not-applicable cells are not counted as missing." title="" id="37" name="Picture"/>
             <a:graphic>
@@ -1098,7 +1098,7 @@
                   <pic:spPr bwMode="auto">
                     <a:xfrm>
                       <a:off x="0" y="0"/>
-                      <a:ext cx="5334000" cy="3613354"/>
+                      <a:ext cx="5334000" cy="3527322"/>
                     </a:xfrm>
                     <a:prstGeom prst="rect">
                       <a:avLst/>
@@ -1150,7 +1150,7 @@
       <w:r>
         <w:drawing>
           <wp:inline>
-            <wp:extent cx="5334000" cy="6331974"/>
+            <wp:extent cx="5334000" cy="6245941"/>
             <wp:effectExtent b="0" l="0" r="0" t="0"/>
             <wp:docPr descr="Figure 2. Early preterm birth prevalence in the 2024 cohort among births with each predictor missing (orange) versus recorded (blue). Labels give the ratio. Items with at least 1,000 missing records are shown; log scale." title="" id="40" name="Picture"/>
             <a:graphic>
@@ -1171,7 +1171,7 @@
                   <pic:spPr bwMode="auto">
                     <a:xfrm>
                       <a:off x="0" y="0"/>
-                      <a:ext cx="5334000" cy="6331974"/>
+                      <a:ext cx="5334000" cy="6245941"/>
                     </a:xfrm>
                     <a:prstGeom prst="rect">
                       <a:avLst/>

</xml_diff>